<commit_message>
Updated Resumen del curso.odt and .docx
</commit_message>
<xml_diff>
--- a/Resumen del curso.docx
+++ b/Resumen del curso.docx
@@ -1081,10 +1081,7 @@
         <w:pStyle w:val="Prrafodelista"/>
       </w:pPr>
       <w:r>
-        <w:t xml:space="preserve">Estratos homogéneos </w:t>
-      </w:r>
-      <w:r>
-        <w:t>entre sí → SRS por cada estrato.</w:t>
+        <w:t>Estratos homogéneos entre sí → SRS por cada estrato.</w:t>
       </w:r>
     </w:p>
     <w:p>
@@ -1143,10 +1140,7 @@
         <w:pStyle w:val="Prrafodelista"/>
       </w:pPr>
       <w:r>
-        <w:t>Grupos heterogéneos entre sí y homogéneos por dentro</w:t>
-      </w:r>
-      <w:r>
-        <w:t xml:space="preserve"> → SRS entre grupos → SRS entre individuos.</w:t>
+        <w:t>Grupos heterogéneos entre sí y homogéneos por dentro → SRS entre grupos → SRS entre individuos.</w:t>
       </w:r>
     </w:p>
     <w:p>
@@ -1437,25 +1431,7 @@
     </w:p>
     <w:p>
       <w:r>
-        <w:t>De no darse el muestreo aleatorio, no podrá generalizarse una muestra a una población.</w:t>
-      </w:r>
-      <w:r>
-        <w:t xml:space="preserve"> Asimismo d</w:t>
-      </w:r>
-      <w:r>
-        <w:t>e no darse la asignación aleatoria</w:t>
-      </w:r>
-      <w:r>
-        <w:t xml:space="preserve"> y</w:t>
-      </w:r>
-      <w:r>
-        <w:t xml:space="preserve"> </w:t>
-      </w:r>
-      <w:r>
-        <w:t>encontrarse</w:t>
-      </w:r>
-      <w:r>
-        <w:t xml:space="preserve"> una correlación, no puede asegurarse que sea una relación causal.</w:t>
+        <w:t>De no darse el muestreo aleatorio, no podrá generalizarse una muestra a una población. Asimismo de no darse la asignación aleatoria y encontrarse una correlación, no puede asegurarse que sea una relación causal.</w:t>
       </w:r>
     </w:p>
     <w:p>
@@ -1943,6 +1919,11 @@
       </w:r>
     </w:p>
     <w:p>
+      <w:pPr>
+        <w:rPr>
+          <w:rStyle w:val="nfasissutil"/>
+        </w:rPr>
+      </w:pPr>
       <w:r>
         <w:rPr>
           <w:noProof/>
@@ -1992,54 +1973,117 @@
         </w:drawing>
       </w:r>
       <w:r>
+        <w:rPr>
+          <w:rStyle w:val="nfasissutil"/>
+        </w:rPr>
         <w:t>Nota: Cuando nos referimos a las muestras, estas medidas se escriben con caracteres latinos. Si se utilizan en cambio puntos estimados de la población entera, los representamos con letras griegas.</w:t>
       </w:r>
     </w:p>
     <w:p>
       <w:pPr>
+        <w:rPr>
+          <w:rStyle w:val="nfasissutil"/>
+        </w:rPr>
+      </w:pPr>
+      <w:r>
+        <w:rPr>
+          <w:rStyle w:val="nfasissutil"/>
+        </w:rPr>
+        <w:t xml:space="preserve">Nota 2: La mediana se dice que es un estadístico robusto, ya que si el valor de una de las muestras cambia mucho, la mediana permanece estable. Esto pasa porque no tiene en cuenta </w:t>
+      </w:r>
+      <w:r>
+        <w:rPr>
+          <w:rStyle w:val="nfasissutil"/>
+        </w:rPr>
+        <w:lastRenderedPageBreak/>
+        <w:t>los valores extremos, a diferencia de la media. Sólo en el caso de que la distribución sea simétrica, mediana = media -&gt; media es robusta.</w:t>
+      </w:r>
+    </w:p>
+    <w:p>
+      <w:pPr>
+        <w:rPr>
+          <w:rStyle w:val="nfasisintenso"/>
+        </w:rPr>
+      </w:pPr>
+      <w:r>
+        <w:rPr>
+          <w:rStyle w:val="nfasisintenso"/>
+        </w:rPr>
+        <w:t>En general, los estadísticos que se basan en percentiles son robustos</w:t>
+      </w:r>
+      <w:r>
+        <w:rPr>
+          <w:rStyle w:val="nfasisintenso"/>
+        </w:rPr>
+        <w:t xml:space="preserve"> (mediana, N-cuantil</w:t>
+      </w:r>
+      <w:r>
+        <w:rPr>
+          <w:rStyle w:val="nfasisintenso"/>
+          <w:vertAlign w:val="subscript"/>
+        </w:rPr>
+        <w:t>i</w:t>
+      </w:r>
+      <w:r>
+        <w:rPr>
+          <w:rStyle w:val="nfasisintenso"/>
+        </w:rPr>
+        <w:t>, IQR,...)</w:t>
+      </w:r>
+      <w:r>
+        <w:rPr>
+          <w:rStyle w:val="nfasisintenso"/>
+        </w:rPr>
+        <w:t xml:space="preserve">. Aquéllos que se basen en la media, el </w:t>
+      </w:r>
+      <w:r>
+        <w:rPr>
+          <w:rStyle w:val="nfasisintenso"/>
+        </w:rPr>
+        <w:t>máx.</w:t>
+      </w:r>
+      <w:r>
+        <w:rPr>
+          <w:rStyle w:val="nfasisintenso"/>
+        </w:rPr>
+        <w:t xml:space="preserve"> o el mín</w:t>
+      </w:r>
+      <w:r>
+        <w:rPr>
+          <w:rStyle w:val="nfasisintenso"/>
+        </w:rPr>
+        <w:t>.</w:t>
+      </w:r>
+      <w:r>
+        <w:rPr>
+          <w:rStyle w:val="nfasisintenso"/>
+        </w:rPr>
+        <w:t>, lo serán si y sólo si la distribución es simétrica.</w:t>
+      </w:r>
+    </w:p>
+    <w:p>
+      <w:pPr>
         <w:pStyle w:val="Ttulo3"/>
       </w:pPr>
       <w:r>
-        <w:lastRenderedPageBreak/>
-        <w:t xml:space="preserve">Medidas de </w:t>
-      </w:r>
-      <w:r>
-        <w:t>dispersión</w:t>
-      </w:r>
-      <w:r>
-        <w:t xml:space="preserve">: </w:t>
-      </w:r>
-      <w:r>
+        <w:t>Medidas de dispersión: Varianza, desviación estándar y mediana</w:t>
+      </w:r>
+    </w:p>
+    <w:p>
+      <w:r>
+        <w:rPr>
+          <w:rStyle w:val="Referenciaintensa"/>
+        </w:rPr>
         <w:t>Varianza</w:t>
       </w:r>
       <w:r>
-        <w:t xml:space="preserve">, </w:t>
-      </w:r>
-      <w:r>
-        <w:t>desviación estándar</w:t>
-      </w:r>
-      <w:r>
-        <w:t xml:space="preserve"> y mediana</w:t>
-      </w:r>
-    </w:p>
-    <w:p>
-      <w:r>
-        <w:rPr>
-          <w:rStyle w:val="Referenciaintensa"/>
-        </w:rPr>
-        <w:t>Varianza</w:t>
-      </w:r>
-      <w:r>
         <w:rPr>
           <w:rStyle w:val="Referenciaintensa"/>
         </w:rPr>
         <w:t>:</w:t>
       </w:r>
       <w:r>
-        <w:t xml:space="preserve"> </w:t>
-      </w:r>
-      <w:r>
-        <w:t>Medida en uds.</w:t>
+        <w:t xml:space="preserve"> Medida en uds.</w:t>
       </w:r>
       <w:r>
         <w:rPr>
@@ -2163,13 +2207,7 @@
       </w:r>
       <w:proofErr w:type="spellEnd"/>
       <w:r>
-        <w:t xml:space="preserve"> de cómo se alejan de la media los valores.</w:t>
-      </w:r>
-      <w:r>
-        <w:t xml:space="preserve"> </w:t>
-      </w:r>
-      <w:r>
-        <w:t>Notación: s</w:t>
+        <w:t xml:space="preserve"> de cómo se alejan de la media los valores. Notación: s</w:t>
       </w:r>
       <w:r>
         <w:rPr>
@@ -2260,7 +2298,15 @@
         <w:rPr>
           <w:rStyle w:val="nfasissutil"/>
         </w:rPr>
-        <w:t>Nota: No confundir variabilidad con diversidad de valores. La variabilidad indica lo mucho que se alejan los valores de la media. La diversidad en cambio indica cuántos valores distintos hay.</w:t>
+        <w:t>Nota: No confundir variabilidad con diversidad de valores. La variabilidad indica lo mucho que se alejan los valores de la media. La diversidad en cambio indica cuántos valores distintos h</w:t>
+      </w:r>
+      <w:bookmarkStart w:id="0" w:name="_GoBack"/>
+      <w:bookmarkEnd w:id="0"/>
+      <w:r>
+        <w:rPr>
+          <w:rStyle w:val="nfasissutil"/>
+        </w:rPr>
+        <w:t>ay.</w:t>
       </w:r>
     </w:p>
     <w:p>
@@ -2320,16 +2366,7 @@
         <w:t xml:space="preserve"> 50%]</w:t>
       </w:r>
       <w:r>
-        <w:t>:</w:t>
-      </w:r>
-      <w:r>
-        <w:t xml:space="preserve"> </w:t>
-      </w:r>
-      <w:r>
-        <w:t>Rango</w:t>
-      </w:r>
-      <w:r>
-        <w:t xml:space="preserve"> en </w:t>
+        <w:t xml:space="preserve">: Rango en </w:t>
       </w:r>
       <w:proofErr w:type="spellStart"/>
       <w:r>
@@ -2337,10 +2374,7 @@
       </w:r>
       <w:proofErr w:type="spellEnd"/>
       <w:r>
-        <w:t xml:space="preserve"> de </w:t>
-      </w:r>
-      <w:r>
-        <w:t>los valores que se toman entre el 25 percentil y el 75 percentil.</w:t>
+        <w:t xml:space="preserve"> de los valores que se toman entre el 25 percentil y el 75 percentil.</w:t>
       </w:r>
     </w:p>
     <w:p>
@@ -2471,14 +2505,7 @@
           <w:rStyle w:val="nfasissutil"/>
           <w:u w:val="single"/>
         </w:rPr>
-        <w:t xml:space="preserve">el valor por debajo del cual se encuentran el 40% de las muestras es el </w:t>
-      </w:r>
-      <w:r>
-        <w:rPr>
-          <w:rStyle w:val="nfasissutil"/>
-          <w:u w:val="single"/>
-        </w:rPr>
-        <w:t>5-cuantil</w:t>
+        <w:t>el valor por debajo del cual se encuentran el 40% de las muestras es el 5-cuantil</w:t>
       </w:r>
       <w:r>
         <w:rPr>
@@ -2556,8 +2583,6 @@
         </w:rPr>
         <w:t>.</w:t>
       </w:r>
-      <w:bookmarkStart w:id="0" w:name="_GoBack"/>
-      <w:bookmarkEnd w:id="0"/>
     </w:p>
     <w:sectPr>
       <w:type w:val="continuous"/>
@@ -3407,6 +3432,7 @@
   <w:style w:type="character" w:default="1" w:styleId="Fuentedeprrafopredeter">
     <w:name w:val="Default Paragraph Font"/>
     <w:uiPriority w:val="1"/>
+    <w:semiHidden/>
     <w:unhideWhenUsed/>
   </w:style>
   <w:style w:type="table" w:default="1" w:styleId="Tablanormal">
@@ -3849,6 +3875,7 @@
   <w:style w:type="character" w:default="1" w:styleId="Fuentedeprrafopredeter">
     <w:name w:val="Default Paragraph Font"/>
     <w:uiPriority w:val="1"/>
+    <w:semiHidden/>
     <w:unhideWhenUsed/>
   </w:style>
   <w:style w:type="table" w:default="1" w:styleId="Tablanormal">

</xml_diff>